<commit_message>
Rewrite analysis with a more formal tone
Co-Authored-By: Claude Opus 5.5 <noreply@anthropic.com>
Claude-Session: https://claude.ai/code/session_012cugsJEu6jJtj4GmQFpvdM
</commit_message>
<xml_diff>
--- a/analisis_interaccion_social.docx
+++ b/analisis_interaccion_social.docx
@@ -12,27 +12,27 @@
     </w:p>
     <w:p>
       <w:r>
-        <w:t>Un día estábamos esperando al profe de Óptica. Éramos seis personas en el salón. El profe suele llegar tarde, así que al principio nadie se preocupó. Nos quedamos platicando, viendo el celular y pasando el rato. Nadie lo buscó ni le escribió. Después de como media hora nos mandó mensaje de que ya no alcanzaba a llegar y ahí fue cuando nos fuimos. Yo la verdad no hice nada, solo me quedé platicando con los demás.</w:t>
+        <w:t>La interacción que elegí fue un día en que esperábamos al profesor de Óptica. Éramos seis personas en el salón. Como el profe suele llegar tarde, al principio nadie se preocupó y nos quedamos platicando y viendo el celular. Nadie intentó contactarlo. Después de casi media hora nos mandó un mensaje diciendo que ya no alcanzaba a llegar, y fue hasta entonces que nos fuimos. Yo no hice nada en particular, solo me quedé platicando con los demás.</w:t>
       </w:r>
     </w:p>
     <w:p>
       <w:r>
-        <w:t>Sí hay una norma social, la regla no escrita de esperar al profe un rato antes de irte, los famosos 15 minutos. También está la de no irte hasta que alguien diga algo, porque nadie quiere ser el primero.</w:t>
+        <w:t>Esta interacción sí responde a una norma social: la regla no escrita de esperar al profesor cierto tiempo antes de irse, que normalmente se dice que son 15 minutos. También funcionó otra norma más implícita, la de no ser el primero en irse, porque irte sin que el profesor diga algo se siente como una falta, aunque el que faltó fue él.</w:t>
       </w:r>
     </w:p>
     <w:p>
       <w:r>
-        <w:t>Lo extraño en lo familiar es que esperamos el doble de lo que dice esa regla y nadie se fue ni le escribió. Como ya sabemos que siempre llega tarde lo vimos normal, pero visto desde fuera es raro que seis personas se queden media hora esperando a alguien sin saber si va a llegar, nomás esperando a que él decidiera por nosotros.</w:t>
+        <w:t>Lo extraño en lo familiar es que esperamos el doble de lo que dice esa regla y nadie se fue ni le escribió. Como ya estamos acostumbrados a que llegue tarde, lo vimos como algo normal. Pero si alguien de fuera viera la escena, le parecería raro que seis personas se queden media hora sentadas esperando a alguien sin saber si va a llegar, dejando que él decida por todos.</w:t>
       </w:r>
     </w:p>
     <w:p>
       <w:r>
-        <w:t>También hay desigualdad, porque la espera no le pesa igual a todos. Mucha gente viene de lejos, por ejemplo una amiga viene desde Zapotlanejo, entonces para ella es mucho tiempo y dinero para que al final no haya clase. Además, si nosotros llegamos tarde sí hay consecuencias, pero si el profe llega tarde o no llega no pasa nada.</w:t>
+        <w:t>También hay desigualdad, porque la espera no afecta igual a todos. Mucha gente viene de lejos, por ejemplo una amiga mía viene desde Zapotlanejo, así que para ella esa media hora implica más tiempo y dinero invertidos en una clase que al final no hubo. Además, se nota una diferencia entre el tiempo del profesor y el de los alumnos: si nosotros llegamos tarde hay consecuencias, pero si él llega tarde o no llega, no pasa nada.</w:t>
       </w:r>
     </w:p>
     <w:p>
       <w:r>
-        <w:t>Y sí hay uso del poder. El profe tuvo el poder aunque ni estaba ahí. Como él pone las faltas y las calificaciones, nos quedamos esperando, y al final fue su mensaje lo que decidió cuándo nos íbamos.</w:t>
+        <w:t>Por último, sí hay un uso del poder. Lo interesante es que el profesor lo ejerció sin estar presente. Como él es quien pone las faltas y las calificaciones, su autoridad bastó para que nos quedáramos esperando, y al final fue su mensaje lo que decidió el momento en que nos íbamos. Es un poder que viene de su papel dentro de la universidad y no de algo que haya hecho ese día.</w:t>
       </w:r>
     </w:p>
     <w:sectPr>

</xml_diff>

<commit_message>
Remove colons from analysis text
Co-Authored-By: Claude Opus 5.5 <noreply@anthropic.com>
Claude-Session: https://claude.ai/code/session_012cugsJEu6jJtj4GmQFpvdM
</commit_message>
<xml_diff>
--- a/analisis_interaccion_social.docx
+++ b/analisis_interaccion_social.docx
@@ -17,7 +17,7 @@
     </w:p>
     <w:p>
       <w:r>
-        <w:t>Esta interacción sí responde a una norma social: la regla no escrita de esperar al profesor cierto tiempo antes de irse, que normalmente se dice que son 15 minutos. También funcionó otra norma más implícita, la de no ser el primero en irse, porque irte sin que el profesor diga algo se siente como una falta, aunque el que faltó fue él.</w:t>
+        <w:t>Esta interacción sí responde a una norma social, que es la regla no escrita de esperar al profesor cierto tiempo antes de irse, que normalmente se dice que son 15 minutos. También funcionó otra norma más implícita, la de no ser el primero en irse, porque irte sin que el profesor diga algo se siente como una falta, aunque el que faltó fue él.</w:t>
       </w:r>
     </w:p>
     <w:p>
@@ -27,7 +27,7 @@
     </w:p>
     <w:p>
       <w:r>
-        <w:t>También hay desigualdad, porque la espera no afecta igual a todos. Mucha gente viene de lejos, por ejemplo una amiga mía viene desde Zapotlanejo, así que para ella esa media hora implica más tiempo y dinero invertidos en una clase que al final no hubo. Además, se nota una diferencia entre el tiempo del profesor y el de los alumnos: si nosotros llegamos tarde hay consecuencias, pero si él llega tarde o no llega, no pasa nada.</w:t>
+        <w:t>También hay desigualdad, porque la espera no afecta igual a todos. Mucha gente viene de lejos, por ejemplo una amiga mía viene desde Zapotlanejo, así que para ella esa media hora implica más tiempo y dinero invertidos en una clase que al final no hubo. Además, se nota una diferencia entre el tiempo del profesor y el de los alumnos, ya que si nosotros llegamos tarde hay consecuencias, pero si él llega tarde o no llega, no pasa nada.</w:t>
       </w:r>
     </w:p>
     <w:p>

</xml_diff>